<commit_message>
content: update Dali guide to late-autumn Nov edition; remove flight numbers across all guides; strip weekday references
</commit_message>
<xml_diff>
--- a/trip/dali-autumn/dali-autumn.docx
+++ b/trip/dali-autumn/dali-autumn.docx
@@ -13,7 +13,7 @@
           <w:b/>
           <w:sz w:val="40"/>
         </w:rPr>
-        <w:t>大理初秋休闲游</w:t>
+        <w:t>大理晚秋休闲游</w:t>
       </w:r>
     </w:p>
     <w:p>
@@ -54,7 +54,7 @@
           <w:b/>
           <w:sz w:val="24"/>
         </w:rPr>
-        <w:t>时间：9月xx日-9月xx日（6天5晚）</w:t>
+        <w:t>时间：11月xx日-11月xx日（6天5晚）</w:t>
       </w:r>
     </w:p>
     <w:p>
@@ -67,7 +67,7 @@
           <w:b w:val="0"/>
           <w:sz w:val="22"/>
         </w:rPr>
-        <w:t>跨市交通: 飞机。去程 MU9698 杭州 12:20→大理 15:50；回程 JD5622 大理 12:40→杭州 16:00。</w:t>
+        <w:t>跨市交通: 飞机。去程 杭州 13:40→大理 17:45；回程 大理 09:50→杭州 12:35。</w:t>
       </w:r>
     </w:p>
     <w:p>
@@ -108,7 +108,7 @@
           <w:b/>
           <w:sz w:val="24"/>
         </w:rPr>
-        <w:t>D1（9月xx日）抵达</w:t>
+        <w:t>D1（11月xx日）抵达</w:t>
       </w:r>
     </w:p>
     <w:p>
@@ -122,7 +122,7 @@
           <w:color w:val="555555"/>
           <w:sz w:val="20"/>
         </w:rPr>
-        <w:t>杭州萧山(12:20) - 大理凤仪(15:50)</w:t>
+        <w:t>杭州萧山(13:40) - 大理凤仪(17:45)</w:t>
       </w:r>
     </w:p>
     <w:p>
@@ -162,7 +162,7 @@
           <w:b/>
           <w:sz w:val="24"/>
         </w:rPr>
-        <w:t>D2（9月xx日）</w:t>
+        <w:t>D2（11月xx日）</w:t>
       </w:r>
     </w:p>
     <w:p>
@@ -217,7 +217,7 @@
           <w:b/>
           <w:sz w:val="24"/>
         </w:rPr>
-        <w:t>D3（9月xx日）</w:t>
+        <w:t>D3（11月xx日）</w:t>
       </w:r>
     </w:p>
     <w:p>
@@ -272,7 +272,7 @@
           <w:b/>
           <w:sz w:val="24"/>
         </w:rPr>
-        <w:t>D4（9月xx日）</w:t>
+        <w:t>D4（11月xx日）</w:t>
       </w:r>
     </w:p>
     <w:p>
@@ -312,7 +312,7 @@
           <w:b/>
           <w:sz w:val="24"/>
         </w:rPr>
-        <w:t>D5（9月xx日）换酒店日</w:t>
+        <w:t>D5（11月xx日）换酒店日</w:t>
       </w:r>
     </w:p>
     <w:p>
@@ -352,7 +352,7 @@
           <w:b/>
           <w:sz w:val="24"/>
         </w:rPr>
-        <w:t>D6（9月xx日）返程</w:t>
+        <w:t>D6（11月xx日）返程</w:t>
       </w:r>
     </w:p>
     <w:p>
@@ -366,7 +366,7 @@
           <w:color w:val="555555"/>
           <w:sz w:val="20"/>
         </w:rPr>
-        <w:t>大理凤仪(12:40) - 杭州萧山(16:00)</w:t>
+        <w:t>大理凤仪(09:50) - 杭州萧山(12:35)</w:t>
       </w:r>
     </w:p>
     <w:p>
@@ -379,7 +379,7 @@
           <w:b w:val="0"/>
           <w:sz w:val="21"/>
         </w:rPr>
-        <w:t>不安排游玩，上午从下关酒店打车直达大理机场返航。</w:t>
+        <w:t>不安排游玩。返程为早班机（09:50），需早起：建议 7:00 前退房，7:30 左右从下关酒店打车前往大理机场。</w:t>
       </w:r>
     </w:p>
     <w:p/>
@@ -407,27 +407,7 @@
           <w:b w:val="0"/>
           <w:sz w:val="22"/>
         </w:rPr>
-        <w:t>行李清单可使用</w:t>
-      </w:r>
-      <w:hyperlink r:id="rId9">
-        <w:r>
-          <w:rPr>
-            <w:color w:val="2A9D8F"/>
-            <w:u w:val="single"/>
-            <w:sz w:val="22"/>
-            <w:szCs w:val="22"/>
-            <w:rFonts w:ascii="Helvetica Neue" w:hAnsi="Helvetica Neue" w:eastAsia="PingFang SC"/>
-          </w:rPr>
-          <w:t>Excel表格</w:t>
-        </w:r>
-      </w:hyperlink>
-      <w:r>
-        <w:rPr>
-          <w:rFonts w:ascii="Helvetica Neue" w:hAnsi="Helvetica Neue" w:eastAsia="PingFang SC"/>
-          <w:b w:val="0"/>
-          <w:sz w:val="22"/>
-        </w:rPr>
-        <w:t>管理。</w:t>
+        <w:t>行李清单见 Excel 表格。</w:t>
       </w:r>
     </w:p>
     <w:p/>
@@ -457,7 +437,22 @@
           <w:b w:val="0"/>
           <w:sz w:val="21"/>
         </w:rPr>
-        <w:t>高原地区注意防晒，9 月备好雨具</w:t>
+        <w:t>高原地区注意防晒；11 月为干季，雨具需求低，早晚温差大需保暖</w:t>
+      </w:r>
+    </w:p>
+    <w:p>
+      <w:pPr>
+        <w:pStyle w:val="ListBullet"/>
+        <w:spacing w:after="60"/>
+        <w:ind w:left="340"/>
+      </w:pPr>
+      <w:r>
+        <w:rPr>
+          <w:rFonts w:ascii="Helvetica Neue" w:hAnsi="Helvetica Neue" w:eastAsia="PingFang SC"/>
+          <w:b w:val="0"/>
+          <w:sz w:val="21"/>
+        </w:rPr>
+        <w:t>大理11月初白天约 19℃、夜间约 8℃，昼夜温差大，早晚需厚外套</w:t>
       </w:r>
     </w:p>
     <w:p>
@@ -502,7 +497,7 @@
           <w:b w:val="0"/>
           <w:sz w:val="21"/>
         </w:rPr>
-        <w:t>**海舌公园仅 9**: 00-12:00 免费开放且每日极度限流</w:t>
+        <w:t>海舌公园仅 9:00-12:00 免费开放且每日极度限流</w:t>
       </w:r>
     </w:p>
     <w:p>
@@ -606,7 +601,7 @@
           <w:b w:val="0"/>
           <w:sz w:val="21"/>
         </w:rPr>
-        <w:t>**中和索道（北）**: 单程约 25 - 30 分钟。露天敞开式双人吊椅（悬空无罩），速度较慢且对儿童存在安全隐患。</w:t>
+        <w:t>**中和索道（北）**: 单程约 **25 - 30 分钟**。露天敞开式双人吊椅（悬空无罩），速度较慢且对儿童存在安全隐患。</w:t>
       </w:r>
     </w:p>
     <w:p>
@@ -621,7 +616,7 @@
           <w:b w:val="0"/>
           <w:sz w:val="21"/>
         </w:rPr>
-        <w:t>**洗马潭大索道（中）**: 全程单程约 35 - 40 分钟。全长 5600 米分两段（下段到中站 15 分钟 ➔ 上段到山顶 20 分钟），高海拔且风大陡阶梯多，山顶易高反。</w:t>
+        <w:t>**洗马潭大索道（中）**: 全程单程约 **35 - 40 分钟**。全长 5600 米分两段（下段到中站 15 分钟 ➔ 上段到山顶 20 分钟），高海拔且风大陡阶梯多，山顶易高反。</w:t>
       </w:r>
     </w:p>
     <w:p>
@@ -636,7 +631,7 @@
           <w:b w:val="0"/>
           <w:sz w:val="21"/>
         </w:rPr>
-        <w:t>**感通索道（南，推荐）**: 单程约 10 - 15 分钟。封闭式箱式缆车，直达 2600 米清碧溪，出站后为平坦木栈道，安全省力无高反，最适合全家游览。</w:t>
+        <w:t>**感通索道（南，推荐）**: 单程约 **10 - 15 分钟**。封闭式箱式缆车，直达 2600 米清碧溪，出站后为平坦木栈道，安全省力无高反，最适合全家游览。</w:t>
       </w:r>
     </w:p>
     <w:p/>

</xml_diff>

<commit_message>
content: unify packing-list line to majority format with feishu link (dali + 3 en guides)
</commit_message>
<xml_diff>
--- a/trip/dali-autumn/dali-autumn.docx
+++ b/trip/dali-autumn/dali-autumn.docx
@@ -407,7 +407,27 @@
           <w:b w:val="0"/>
           <w:sz w:val="22"/>
         </w:rPr>
-        <w:t>行李清单见 Excel 表格。</w:t>
+        <w:t>行李清单可使用</w:t>
+      </w:r>
+      <w:hyperlink r:id="rId9">
+        <w:r>
+          <w:rPr>
+            <w:color w:val="2A9D8F"/>
+            <w:u w:val="single"/>
+            <w:sz w:val="22"/>
+            <w:szCs w:val="22"/>
+            <w:rFonts w:ascii="Helvetica Neue" w:hAnsi="Helvetica Neue" w:eastAsia="PingFang SC"/>
+          </w:rPr>
+          <w:t>Excel表格</w:t>
+        </w:r>
+      </w:hyperlink>
+      <w:r>
+        <w:rPr>
+          <w:rFonts w:ascii="Helvetica Neue" w:hAnsi="Helvetica Neue" w:eastAsia="PingFang SC"/>
+          <w:b w:val="0"/>
+          <w:sz w:val="22"/>
+        </w:rPr>
+        <w:t>管理。</w:t>
       </w:r>
     </w:p>
     <w:p/>

</xml_diff>